<commit_message>
actualicé el nombre para el prograa del curso de machine learning
</commit_message>
<xml_diff>
--- a/1_programa_curso_machine_learning_python.docx
+++ b/1_programa_curso_machine_learning_python.docx
@@ -262,8 +262,8 @@
       </w:tblPr>
       <w:tblGrid>
         <w:gridCol w:w="1422"/>
-        <w:gridCol w:w="140"/>
-        <w:gridCol w:w="994"/>
+        <w:gridCol w:w="139"/>
+        <w:gridCol w:w="995"/>
         <w:gridCol w:w="2411"/>
         <w:gridCol w:w="282"/>
         <w:gridCol w:w="113"/>
@@ -272,8 +272,8 @@
         <w:gridCol w:w="1133"/>
         <w:gridCol w:w="567"/>
         <w:gridCol w:w="823"/>
-        <w:gridCol w:w="739"/>
-        <w:gridCol w:w="1415"/>
+        <w:gridCol w:w="740"/>
+        <w:gridCol w:w="1414"/>
       </w:tblGrid>
       <w:tr>
         <w:trPr>
@@ -371,14 +371,13 @@
             <w:pPr>
               <w:pStyle w:val="Normal"/>
               <w:widowControl w:val="false"/>
-              <w:rPr/>
-            </w:pPr>
-            <w:r>
-              <w:rPr>
-                <w:sz w:val="22"/>
-                <w:szCs w:val="22"/>
-              </w:rPr>
-              <w:t>Facultad de Ciencias Agrarias</w:t>
+              <w:rPr>
+                <w:sz w:val="22"/>
+                <w:szCs w:val="22"/>
+              </w:rPr>
+            </w:pPr>
+            <w:r>
+              <w:rPr/>
             </w:r>
           </w:p>
         </w:tc>
@@ -435,14 +434,13 @@
             <w:pPr>
               <w:pStyle w:val="Normal"/>
               <w:widowControl w:val="false"/>
-              <w:rPr/>
-            </w:pPr>
-            <w:r>
-              <w:rPr>
-                <w:sz w:val="22"/>
-                <w:szCs w:val="22"/>
-              </w:rPr>
-              <w:t>Ingeniería Agropecuaria</w:t>
+              <w:rPr>
+                <w:sz w:val="22"/>
+                <w:szCs w:val="22"/>
+              </w:rPr>
+            </w:pPr>
+            <w:r>
+              <w:rPr/>
             </w:r>
           </w:p>
         </w:tc>
@@ -504,7 +502,25 @@
               <w:rPr>
                 <w:color w:val="808080"/>
               </w:rPr>
-              <w:t>2023-II / 2024-I</w:t>
+              <w:t>202</w:t>
+            </w:r>
+            <w:r>
+              <w:rPr>
+                <w:color w:val="808080"/>
+              </w:rPr>
+              <w:t>4</w:t>
+            </w:r>
+            <w:r>
+              <w:rPr>
+                <w:color w:val="808080"/>
+              </w:rPr>
+              <w:t>-I / 2024-I</w:t>
+            </w:r>
+            <w:r>
+              <w:rPr>
+                <w:color w:val="808080"/>
+              </w:rPr>
+              <w:t>I</w:t>
             </w:r>
           </w:p>
         </w:tc>
@@ -556,15 +572,14 @@
             <w:pPr>
               <w:pStyle w:val="Normal"/>
               <w:widowControl w:val="false"/>
-              <w:rPr/>
-            </w:pPr>
-            <w:r>
-              <w:rPr>
-                <w:color w:val="808080"/>
-                <w:sz w:val="22"/>
-                <w:szCs w:val="22"/>
-              </w:rPr>
-              <w:t>5009319</w:t>
+              <w:rPr>
+                <w:color w:val="808080"/>
+                <w:sz w:val="22"/>
+                <w:szCs w:val="22"/>
+              </w:rPr>
+            </w:pPr>
+            <w:r>
+              <w:rPr/>
             </w:r>
           </w:p>
         </w:tc>
@@ -629,7 +644,7 @@
                 <w:sz w:val="22"/>
                 <w:szCs w:val="22"/>
               </w:rPr>
-              <w:t>Cálculo</w:t>
+              <w:t>Introducción al Machine Learning con Python</w:t>
             </w:r>
           </w:p>
         </w:tc>
@@ -743,7 +758,7 @@
         </w:trPr>
         <w:tc>
           <w:tcPr>
-            <w:tcW w:w="1562" w:type="dxa"/>
+            <w:tcW w:w="1561" w:type="dxa"/>
             <w:gridSpan w:val="2"/>
             <w:tcBorders>
               <w:top w:val="single" w:sz="4" w:space="0" w:color="7F7F7F"/>
@@ -775,7 +790,7 @@
         </w:tc>
         <w:tc>
           <w:tcPr>
-            <w:tcW w:w="3687" w:type="dxa"/>
+            <w:tcW w:w="3688" w:type="dxa"/>
             <w:gridSpan w:val="3"/>
             <w:tcBorders>
               <w:top w:val="single" w:sz="4" w:space="0" w:color="7F7F7F"/>
@@ -1163,7 +1178,7 @@
             </w:pPr>
             <w:r>
               <w:rPr/>
-              <w:t>Álgebra y trigonometría</w:t>
+              <w:t>Es un curso autocontenido</w:t>
             </w:r>
           </w:p>
         </w:tc>
@@ -1220,15 +1235,14 @@
             <w:pPr>
               <w:pStyle w:val="Normal"/>
               <w:widowControl w:val="false"/>
-              <w:rPr/>
-            </w:pPr>
-            <w:r>
-              <w:rPr>
-                <w:color w:val="808080"/>
-                <w:sz w:val="22"/>
-                <w:szCs w:val="22"/>
-              </w:rPr>
-              <w:t>Física, Geometría vectorial</w:t>
+              <w:rPr>
+                <w:color w:val="808080"/>
+                <w:sz w:val="22"/>
+                <w:szCs w:val="22"/>
+              </w:rPr>
+            </w:pPr>
+            <w:r>
+              <w:rPr/>
             </w:r>
           </w:p>
         </w:tc>
@@ -1306,7 +1320,7 @@
         </w:tc>
         <w:tc>
           <w:tcPr>
-            <w:tcW w:w="3594" w:type="dxa"/>
+            <w:tcW w:w="3595" w:type="dxa"/>
             <w:gridSpan w:val="5"/>
             <w:tcBorders>
               <w:top w:val="single" w:sz="4" w:space="0" w:color="7F7F7F"/>
@@ -1338,7 +1352,7 @@
         </w:tc>
         <w:tc>
           <w:tcPr>
-            <w:tcW w:w="1415" w:type="dxa"/>
+            <w:tcW w:w="1414" w:type="dxa"/>
             <w:tcBorders>
               <w:top w:val="single" w:sz="4" w:space="0" w:color="7F7F7F"/>
               <w:bottom w:val="single" w:sz="4" w:space="0" w:color="7F7F7F"/>
@@ -1701,205 +1715,40 @@
                 <w:sz w:val="22"/>
                 <w:szCs w:val="22"/>
               </w:rPr>
-              <w:t>Este curso tiene como objetivo proporcionar a los estudiantes del Programa de Ingeniería Agropecuaria de la Facultad de Ciencias Agrarias de la Universidad de Antioquia una base sólida en Cálculo Diferencial, utilizando una metodología innovadora centrada en el enfoque de aula invertida. El curso busca integrar la teoría con la práctica y fomentar habilidades de comunicación científica a través del uso de herramientas tecnológicas y la promoción de la ciencia libre. Para lograr esto, el curso se apoyará en clases de acceso libre en la red social GitHub, video clases en el canal de YouTube "DiMathData" y la enseñanza de lenguajes como Python, Git, LaTeX y Markdown.</w:t>
-            </w:r>
-          </w:p>
-          <w:p>
-            <w:pPr>
-              <w:pStyle w:val="Normal"/>
-              <w:widowControl w:val="false"/>
-              <w:rPr>
-                <w:color w:val="808080"/>
-                <w:sz w:val="22"/>
-                <w:szCs w:val="22"/>
-              </w:rPr>
-            </w:pPr>
-            <w:r>
-              <w:rPr>
-                <w:color w:val="808080"/>
-                <w:sz w:val="22"/>
-                <w:szCs w:val="22"/>
-              </w:rPr>
-            </w:r>
-          </w:p>
-          <w:p>
-            <w:pPr>
-              <w:pStyle w:val="Normal"/>
-              <w:widowControl w:val="false"/>
-              <w:rPr/>
-            </w:pPr>
-            <w:r>
-              <w:rPr>
-                <w:color w:val="808080"/>
-                <w:sz w:val="22"/>
-                <w:szCs w:val="22"/>
-              </w:rPr>
-              <w:t>**Problematización y Coherencia con los Propósitos de Formación**</w:t>
-            </w:r>
-          </w:p>
-          <w:p>
-            <w:pPr>
-              <w:pStyle w:val="Normal"/>
-              <w:widowControl w:val="false"/>
-              <w:rPr>
-                <w:color w:val="808080"/>
-                <w:sz w:val="22"/>
-                <w:szCs w:val="22"/>
-              </w:rPr>
-            </w:pPr>
-            <w:r>
-              <w:rPr>
-                <w:color w:val="808080"/>
-                <w:sz w:val="22"/>
-                <w:szCs w:val="22"/>
-              </w:rPr>
-            </w:r>
-          </w:p>
-          <w:p>
-            <w:pPr>
-              <w:pStyle w:val="Normal"/>
-              <w:widowControl w:val="false"/>
-              <w:rPr/>
-            </w:pPr>
-            <w:r>
-              <w:rPr>
-                <w:color w:val="808080"/>
-                <w:sz w:val="22"/>
-                <w:szCs w:val="22"/>
-              </w:rPr>
-              <w:t>El Programa de Ingeniería Agropecuaria de la Facultad de Ciencias Agrarias tiene como propósito formar profesionales capaces de abordar problemáticas agrícolas y pecuarias desde una perspectiva científica y técnica. Sin embargo, se ha identificado una problemática recurrente: la dificultad de los estudiantes para asimilar conceptos matemáticos y aplicarlos de manera efectiva en su campo. Esto limita su capacidad para abordar desafíos agropecuarios desde un enfoque cuantitativo y analítico.</w:t>
-            </w:r>
-          </w:p>
-          <w:p>
-            <w:pPr>
-              <w:pStyle w:val="Normal"/>
-              <w:widowControl w:val="false"/>
-              <w:rPr>
-                <w:color w:val="808080"/>
-                <w:sz w:val="22"/>
-                <w:szCs w:val="22"/>
-              </w:rPr>
-            </w:pPr>
-            <w:r>
-              <w:rPr>
-                <w:color w:val="808080"/>
-                <w:sz w:val="22"/>
-                <w:szCs w:val="22"/>
-              </w:rPr>
-            </w:r>
-          </w:p>
-          <w:p>
-            <w:pPr>
-              <w:pStyle w:val="Normal"/>
-              <w:widowControl w:val="false"/>
-              <w:rPr/>
-            </w:pPr>
-            <w:r>
-              <w:rPr>
-                <w:color w:val="808080"/>
-                <w:sz w:val="22"/>
-                <w:szCs w:val="22"/>
-              </w:rPr>
-              <w:t>La enseñanza tradicional de las matemáticas puede resultar abrumadora y desmotivante para muchos estudiantes, alejándolos de su aplicación práctica en la ingeniería agropecuaria. Aquí es donde entra en juego la metodología de aula invertida, que permite a los estudiantes aprender a su propio ritmo y en su propio estilo, brindándoles la oportunidad de aplicar los conceptos matemáticos en situaciones relevantes para su campo.</w:t>
-            </w:r>
-          </w:p>
-          <w:p>
-            <w:pPr>
-              <w:pStyle w:val="Normal"/>
-              <w:widowControl w:val="false"/>
-              <w:rPr>
-                <w:color w:val="808080"/>
-                <w:sz w:val="22"/>
-                <w:szCs w:val="22"/>
-              </w:rPr>
-            </w:pPr>
-            <w:r>
-              <w:rPr>
-                <w:color w:val="808080"/>
-                <w:sz w:val="22"/>
-                <w:szCs w:val="22"/>
-              </w:rPr>
-            </w:r>
-          </w:p>
-          <w:p>
-            <w:pPr>
-              <w:pStyle w:val="Normal"/>
-              <w:widowControl w:val="false"/>
-              <w:rPr/>
-            </w:pPr>
-            <w:r>
-              <w:rPr>
-                <w:color w:val="808080"/>
-                <w:sz w:val="22"/>
-                <w:szCs w:val="22"/>
-              </w:rPr>
-              <w:t>**Justificación y Pertinencia del Curso en el Contexto del Núcleo de Formación**</w:t>
-            </w:r>
-          </w:p>
-          <w:p>
-            <w:pPr>
-              <w:pStyle w:val="Normal"/>
-              <w:widowControl w:val="false"/>
-              <w:rPr>
-                <w:color w:val="808080"/>
-                <w:sz w:val="22"/>
-                <w:szCs w:val="22"/>
-              </w:rPr>
-            </w:pPr>
-            <w:r>
-              <w:rPr>
-                <w:color w:val="808080"/>
-                <w:sz w:val="22"/>
-                <w:szCs w:val="22"/>
-              </w:rPr>
-            </w:r>
-          </w:p>
-          <w:p>
-            <w:pPr>
-              <w:pStyle w:val="Normal"/>
-              <w:widowControl w:val="false"/>
-              <w:rPr/>
-            </w:pPr>
-            <w:r>
-              <w:rPr>
-                <w:color w:val="808080"/>
-                <w:sz w:val="22"/>
-                <w:szCs w:val="22"/>
-              </w:rPr>
-              <w:t>Este curso es altamente pertinente en el contexto del Núcleo de Formación del Programa de Ingeniería Agropecuaria, ya que aborda directamente la problemática identificada en relación con las dificultades de los estudiantes para aplicar las matemáticas en su campo de estudio. La metodología de aula invertida permite a los estudiantes comprender y aplicar los conceptos de cálculo diferencial a través de ejemplos y casos concretos relacionados con la ingeniería agropecuaria. Además, el énfasis en la promoción de la ciencia libre y el uso de herramientas tecnológicas como Python, Git, LaTeX y Markdown capacitará a los estudiantes para comunicar de manera efectiva sus resultados y contribuciones científicas, lo que es esencial en la formación de ingenieros agropecuarios comprometidos con la investigación y la innovación.</w:t>
-            </w:r>
-          </w:p>
-          <w:p>
-            <w:pPr>
-              <w:pStyle w:val="Normal"/>
-              <w:widowControl w:val="false"/>
-              <w:rPr>
-                <w:color w:val="808080"/>
-                <w:sz w:val="22"/>
-                <w:szCs w:val="22"/>
-              </w:rPr>
-            </w:pPr>
-            <w:r>
-              <w:rPr>
-                <w:color w:val="808080"/>
-                <w:sz w:val="22"/>
-                <w:szCs w:val="22"/>
-              </w:rPr>
-            </w:r>
-          </w:p>
-          <w:p>
-            <w:pPr>
-              <w:pStyle w:val="Normal"/>
-              <w:widowControl w:val="false"/>
-              <w:rPr/>
-            </w:pPr>
-            <w:r>
-              <w:rPr>
-                <w:color w:val="808080"/>
-                <w:sz w:val="22"/>
-                <w:szCs w:val="22"/>
-              </w:rPr>
-              <w:t>En resumen, este curso busca transformar la experiencia de aprendizaje de los estudiantes de ingeniería agropecuaria al hacer que las matemáticas y el cálculo diferencial sean accesibles, relevantes y aplicables a su campo, al tiempo que promueve habilidades de comunicación científica y el uso de herramientas tecnológicas modernas. Esto contribuirá directamente a la formación integral y al perfil profesional de los futuros ingenieros agropecuarios de la Universidad de Antioquia.</w:t>
+              <w:t xml:space="preserve">   </w:t>
+            </w:r>
+          </w:p>
+          <w:p>
+            <w:pPr>
+              <w:pStyle w:val="Normal"/>
+              <w:widowControl w:val="false"/>
+              <w:rPr>
+                <w:color w:val="808080"/>
+                <w:sz w:val="22"/>
+                <w:szCs w:val="22"/>
+              </w:rPr>
+            </w:pPr>
+            <w:r>
+              <w:rPr>
+                <w:color w:val="808080"/>
+                <w:sz w:val="22"/>
+                <w:szCs w:val="22"/>
+              </w:rPr>
+            </w:r>
+          </w:p>
+          <w:p>
+            <w:pPr>
+              <w:pStyle w:val="Normal"/>
+              <w:widowControl w:val="false"/>
+              <w:rPr/>
+            </w:pPr>
+            <w:r>
+              <w:rPr>
+                <w:color w:val="808080"/>
+                <w:sz w:val="22"/>
+                <w:szCs w:val="22"/>
+              </w:rPr>
+              <w:t xml:space="preserve">  </w:t>
             </w:r>
           </w:p>
           <w:p>
@@ -4287,8 +4136,8 @@
         <w:tblLook w:val="0600" w:noHBand="1" w:noVBand="1" w:firstColumn="0" w:lastRow="0" w:lastColumn="0" w:firstRow="0"/>
       </w:tblPr>
       <w:tblGrid>
-        <w:gridCol w:w="6098"/>
-        <w:gridCol w:w="1418"/>
+        <w:gridCol w:w="6097"/>
+        <w:gridCol w:w="1419"/>
         <w:gridCol w:w="2979"/>
       </w:tblGrid>
       <w:tr>
@@ -5056,7 +4905,7 @@
         </w:trPr>
         <w:tc>
           <w:tcPr>
-            <w:tcW w:w="6098" w:type="dxa"/>
+            <w:tcW w:w="6097" w:type="dxa"/>
             <w:tcBorders>
               <w:top w:val="single" w:sz="4" w:space="0" w:color="7F7F7F"/>
               <w:left w:val="single" w:sz="4" w:space="0" w:color="7F7F7F"/>
@@ -5089,7 +4938,7 @@
         </w:tc>
         <w:tc>
           <w:tcPr>
-            <w:tcW w:w="1418" w:type="dxa"/>
+            <w:tcW w:w="1419" w:type="dxa"/>
             <w:tcBorders>
               <w:top w:val="single" w:sz="4" w:space="0" w:color="7F7F7F"/>
               <w:left w:val="single" w:sz="4" w:space="0" w:color="7F7F7F"/>
@@ -5160,7 +5009,7 @@
         </w:trPr>
         <w:tc>
           <w:tcPr>
-            <w:tcW w:w="6098" w:type="dxa"/>
+            <w:tcW w:w="6097" w:type="dxa"/>
             <w:tcBorders>
               <w:top w:val="single" w:sz="4" w:space="0" w:color="7F7F7F"/>
               <w:left w:val="single" w:sz="4" w:space="0" w:color="7F7F7F"/>
@@ -5188,7 +5037,7 @@
         </w:tc>
         <w:tc>
           <w:tcPr>
-            <w:tcW w:w="1418" w:type="dxa"/>
+            <w:tcW w:w="1419" w:type="dxa"/>
             <w:tcBorders>
               <w:top w:val="single" w:sz="4" w:space="0" w:color="7F7F7F"/>
               <w:left w:val="single" w:sz="4" w:space="0" w:color="7F7F7F"/>
@@ -5250,7 +5099,7 @@
         </w:trPr>
         <w:tc>
           <w:tcPr>
-            <w:tcW w:w="6098" w:type="dxa"/>
+            <w:tcW w:w="6097" w:type="dxa"/>
             <w:tcBorders>
               <w:top w:val="single" w:sz="4" w:space="0" w:color="7F7F7F"/>
               <w:left w:val="single" w:sz="4" w:space="0" w:color="7F7F7F"/>
@@ -5278,7 +5127,7 @@
         </w:tc>
         <w:tc>
           <w:tcPr>
-            <w:tcW w:w="1418" w:type="dxa"/>
+            <w:tcW w:w="1419" w:type="dxa"/>
             <w:tcBorders>
               <w:top w:val="single" w:sz="4" w:space="0" w:color="7F7F7F"/>
               <w:left w:val="single" w:sz="4" w:space="0" w:color="7F7F7F"/>
@@ -5340,7 +5189,7 @@
         </w:trPr>
         <w:tc>
           <w:tcPr>
-            <w:tcW w:w="6098" w:type="dxa"/>
+            <w:tcW w:w="6097" w:type="dxa"/>
             <w:tcBorders>
               <w:top w:val="single" w:sz="4" w:space="0" w:color="7F7F7F"/>
               <w:left w:val="single" w:sz="4" w:space="0" w:color="7F7F7F"/>
@@ -5368,7 +5217,7 @@
         </w:tc>
         <w:tc>
           <w:tcPr>
-            <w:tcW w:w="1418" w:type="dxa"/>
+            <w:tcW w:w="1419" w:type="dxa"/>
             <w:tcBorders>
               <w:top w:val="single" w:sz="4" w:space="0" w:color="7F7F7F"/>
               <w:left w:val="single" w:sz="4" w:space="0" w:color="7F7F7F"/>
@@ -5430,7 +5279,7 @@
         </w:trPr>
         <w:tc>
           <w:tcPr>
-            <w:tcW w:w="6098" w:type="dxa"/>
+            <w:tcW w:w="6097" w:type="dxa"/>
             <w:tcBorders>
               <w:top w:val="single" w:sz="4" w:space="0" w:color="7F7F7F"/>
               <w:left w:val="single" w:sz="4" w:space="0" w:color="7F7F7F"/>
@@ -5458,7 +5307,7 @@
         </w:tc>
         <w:tc>
           <w:tcPr>
-            <w:tcW w:w="1418" w:type="dxa"/>
+            <w:tcW w:w="1419" w:type="dxa"/>
             <w:tcBorders>
               <w:top w:val="single" w:sz="4" w:space="0" w:color="7F7F7F"/>
               <w:left w:val="single" w:sz="4" w:space="0" w:color="7F7F7F"/>
@@ -5520,7 +5369,7 @@
         </w:trPr>
         <w:tc>
           <w:tcPr>
-            <w:tcW w:w="6098" w:type="dxa"/>
+            <w:tcW w:w="6097" w:type="dxa"/>
             <w:tcBorders>
               <w:left w:val="single" w:sz="4" w:space="0" w:color="7F7F7F"/>
               <w:bottom w:val="single" w:sz="4" w:space="0" w:color="7F7F7F"/>
@@ -5543,7 +5392,7 @@
         </w:tc>
         <w:tc>
           <w:tcPr>
-            <w:tcW w:w="1418" w:type="dxa"/>
+            <w:tcW w:w="1419" w:type="dxa"/>
             <w:tcBorders>
               <w:left w:val="single" w:sz="4" w:space="0" w:color="7F7F7F"/>
               <w:bottom w:val="single" w:sz="4" w:space="0" w:color="7F7F7F"/>
@@ -5602,7 +5451,7 @@
         </w:trPr>
         <w:tc>
           <w:tcPr>
-            <w:tcW w:w="6098" w:type="dxa"/>
+            <w:tcW w:w="6097" w:type="dxa"/>
             <w:tcBorders>
               <w:left w:val="single" w:sz="4" w:space="0" w:color="7F7F7F"/>
               <w:bottom w:val="single" w:sz="4" w:space="0" w:color="7F7F7F"/>
@@ -5625,7 +5474,7 @@
         </w:tc>
         <w:tc>
           <w:tcPr>
-            <w:tcW w:w="1418" w:type="dxa"/>
+            <w:tcW w:w="1419" w:type="dxa"/>
             <w:tcBorders>
               <w:left w:val="single" w:sz="4" w:space="0" w:color="7F7F7F"/>
               <w:bottom w:val="single" w:sz="4" w:space="0" w:color="7F7F7F"/>
@@ -5683,7 +5532,7 @@
         </w:trPr>
         <w:tc>
           <w:tcPr>
-            <w:tcW w:w="6098" w:type="dxa"/>
+            <w:tcW w:w="6097" w:type="dxa"/>
             <w:tcBorders>
               <w:left w:val="single" w:sz="4" w:space="0" w:color="7F7F7F"/>
               <w:bottom w:val="single" w:sz="4" w:space="0" w:color="7F7F7F"/>
@@ -5706,7 +5555,7 @@
         </w:tc>
         <w:tc>
           <w:tcPr>
-            <w:tcW w:w="1418" w:type="dxa"/>
+            <w:tcW w:w="1419" w:type="dxa"/>
             <w:tcBorders>
               <w:left w:val="single" w:sz="4" w:space="0" w:color="7F7F7F"/>
               <w:bottom w:val="single" w:sz="4" w:space="0" w:color="7F7F7F"/>
@@ -5764,7 +5613,7 @@
         </w:trPr>
         <w:tc>
           <w:tcPr>
-            <w:tcW w:w="6098" w:type="dxa"/>
+            <w:tcW w:w="6097" w:type="dxa"/>
             <w:tcBorders>
               <w:left w:val="single" w:sz="4" w:space="0" w:color="7F7F7F"/>
               <w:bottom w:val="single" w:sz="4" w:space="0" w:color="7F7F7F"/>
@@ -5787,7 +5636,7 @@
         </w:tc>
         <w:tc>
           <w:tcPr>
-            <w:tcW w:w="1418" w:type="dxa"/>
+            <w:tcW w:w="1419" w:type="dxa"/>
             <w:tcBorders>
               <w:left w:val="single" w:sz="4" w:space="0" w:color="7F7F7F"/>
               <w:bottom w:val="single" w:sz="4" w:space="0" w:color="7F7F7F"/>
@@ -7791,7 +7640,7 @@
         <w:rFonts w:eastAsia="Calibri" w:cs="Calibri" w:ascii="Calibri" w:hAnsi="Calibri"/>
         <w:color w:val="000000"/>
       </w:rPr>
-      <w:t>8</w:t>
+      <w:t>7</w:t>
     </w:r>
     <w:r>
       <w:rPr>
@@ -7845,7 +7694,7 @@
         <w:rFonts w:eastAsia="Calibri" w:cs="Calibri" w:ascii="Calibri" w:hAnsi="Calibri"/>
         <w:color w:val="000000"/>
       </w:rPr>
-      <w:t>8</w:t>
+      <w:t>7</w:t>
     </w:r>
     <w:r>
       <w:rPr>

</xml_diff>

<commit_message>
llegué a la descripción del cursod e amchine learning
</commit_message>
<xml_diff>
--- a/1_programa_curso_machine_learning_python.docx
+++ b/1_programa_curso_machine_learning_python.docx
@@ -272,8 +272,8 @@
         <w:gridCol w:w="1133"/>
         <w:gridCol w:w="567"/>
         <w:gridCol w:w="823"/>
-        <w:gridCol w:w="740"/>
-        <w:gridCol w:w="1414"/>
+        <w:gridCol w:w="741"/>
+        <w:gridCol w:w="1413"/>
       </w:tblGrid>
       <w:tr>
         <w:trPr>
@@ -377,7 +377,11 @@
               </w:rPr>
             </w:pPr>
             <w:r>
-              <w:rPr/>
+              <w:rPr>
+                <w:sz w:val="22"/>
+                <w:szCs w:val="22"/>
+              </w:rPr>
+              <w:t>Dirección de regionalización</w:t>
             </w:r>
           </w:p>
         </w:tc>
@@ -414,7 +418,7 @@
                 <w:sz w:val="22"/>
                 <w:szCs w:val="22"/>
               </w:rPr>
-              <w:t>Programas académicos a los cuales se ofrece el curso:</w:t>
+              <w:t xml:space="preserve">Programas académicos a los cuales se ofrece el curso: </w:t>
             </w:r>
           </w:p>
         </w:tc>
@@ -435,12 +439,16 @@
               <w:pStyle w:val="Normal"/>
               <w:widowControl w:val="false"/>
               <w:rPr>
-                <w:sz w:val="22"/>
-                <w:szCs w:val="22"/>
-              </w:rPr>
-            </w:pPr>
-            <w:r>
-              <w:rPr/>
+                <w:b/>
+                <w:sz w:val="22"/>
+                <w:szCs w:val="22"/>
+              </w:rPr>
+            </w:pPr>
+            <w:r>
+              <w:rPr>
+                <w:b/>
+              </w:rPr>
+              <w:t>Todos los programas de la Universidad de Antioquia</w:t>
             </w:r>
           </w:p>
         </w:tc>
@@ -502,25 +510,7 @@
               <w:rPr>
                 <w:color w:val="808080"/>
               </w:rPr>
-              <w:t>202</w:t>
-            </w:r>
-            <w:r>
-              <w:rPr>
-                <w:color w:val="808080"/>
-              </w:rPr>
-              <w:t>4</w:t>
-            </w:r>
-            <w:r>
-              <w:rPr>
-                <w:color w:val="808080"/>
-              </w:rPr>
-              <w:t>-I / 2024-I</w:t>
-            </w:r>
-            <w:r>
-              <w:rPr>
-                <w:color w:val="808080"/>
-              </w:rPr>
-              <w:t>I</w:t>
+              <w:t>2024-I / 2024-II</w:t>
             </w:r>
           </w:p>
         </w:tc>
@@ -579,7 +569,11 @@
               </w:rPr>
             </w:pPr>
             <w:r>
-              <w:rPr/>
+              <w:rPr>
+                <w:color w:val="808080"/>
+                <w:sz w:val="22"/>
+                <w:szCs w:val="22"/>
+              </w:rPr>
             </w:r>
           </w:p>
         </w:tc>
@@ -1242,7 +1236,11 @@
               </w:rPr>
             </w:pPr>
             <w:r>
-              <w:rPr/>
+              <w:rPr>
+                <w:color w:val="808080"/>
+                <w:sz w:val="22"/>
+                <w:szCs w:val="22"/>
+              </w:rPr>
             </w:r>
           </w:p>
         </w:tc>
@@ -1320,7 +1318,7 @@
         </w:tc>
         <w:tc>
           <w:tcPr>
-            <w:tcW w:w="3595" w:type="dxa"/>
+            <w:tcW w:w="3596" w:type="dxa"/>
             <w:gridSpan w:val="5"/>
             <w:tcBorders>
               <w:top w:val="single" w:sz="4" w:space="0" w:color="7F7F7F"/>
@@ -1352,7 +1350,7 @@
         </w:tc>
         <w:tc>
           <w:tcPr>
-            <w:tcW w:w="1414" w:type="dxa"/>
+            <w:tcW w:w="1413" w:type="dxa"/>
             <w:tcBorders>
               <w:top w:val="single" w:sz="4" w:space="0" w:color="7F7F7F"/>
               <w:bottom w:val="single" w:sz="4" w:space="0" w:color="7F7F7F"/>
@@ -1674,33 +1672,149 @@
             <w:pPr>
               <w:pStyle w:val="Normal"/>
               <w:widowControl w:val="false"/>
-              <w:rPr/>
-            </w:pPr>
-            <w:r>
-              <w:rPr>
-                <w:color w:val="808080"/>
-                <w:sz w:val="22"/>
-                <w:szCs w:val="22"/>
-              </w:rPr>
-              <w:t>**Descripción del Curso: Cálculo Diferencial para Ingenieros Agropecuarios con Enfoque Pedagógico de Aula Invertida y Promoción de la Ciencia Libre**</w:t>
-            </w:r>
-          </w:p>
-          <w:p>
-            <w:pPr>
-              <w:pStyle w:val="Normal"/>
-              <w:widowControl w:val="false"/>
-              <w:rPr>
-                <w:color w:val="808080"/>
-                <w:sz w:val="22"/>
-                <w:szCs w:val="22"/>
-              </w:rPr>
-            </w:pPr>
-            <w:r>
-              <w:rPr>
-                <w:color w:val="808080"/>
-                <w:sz w:val="22"/>
-                <w:szCs w:val="22"/>
-              </w:rPr>
+              <w:rPr>
+                <w:color w:val="808080"/>
+                <w:sz w:val="22"/>
+                <w:szCs w:val="22"/>
+              </w:rPr>
+            </w:pPr>
+            <w:r>
+              <w:rPr>
+                <w:color w:val="808080"/>
+                <w:sz w:val="22"/>
+                <w:szCs w:val="22"/>
+              </w:rPr>
+            </w:r>
+          </w:p>
+          <w:p>
+            <w:pPr>
+              <w:pStyle w:val="Normal"/>
+              <w:widowControl w:val="false"/>
+              <w:rPr/>
+            </w:pPr>
+            <w:r>
+              <w:rPr>
+                <w:color w:val="808080"/>
+                <w:sz w:val="22"/>
+                <w:szCs w:val="22"/>
+              </w:rPr>
+              <w:t>**Título del Curso: Introducción al Machine Learning con Python y Desarrollo de Habilidades Científicas**</w:t>
+            </w:r>
+          </w:p>
+          <w:p>
+            <w:pPr>
+              <w:pStyle w:val="Normal"/>
+              <w:widowControl w:val="false"/>
+              <w:rPr>
+                <w:color w:val="808080"/>
+                <w:sz w:val="22"/>
+                <w:szCs w:val="22"/>
+              </w:rPr>
+            </w:pPr>
+            <w:r>
+              <w:rPr/>
+            </w:r>
+          </w:p>
+          <w:p>
+            <w:pPr>
+              <w:pStyle w:val="Normal"/>
+              <w:widowControl w:val="false"/>
+              <w:rPr/>
+            </w:pPr>
+            <w:r>
+              <w:rPr>
+                <w:color w:val="808080"/>
+                <w:sz w:val="22"/>
+                <w:szCs w:val="22"/>
+              </w:rPr>
+              <w:t>**Descripción:**</w:t>
+            </w:r>
+          </w:p>
+          <w:p>
+            <w:pPr>
+              <w:pStyle w:val="Normal"/>
+              <w:widowControl w:val="false"/>
+              <w:rPr>
+                <w:color w:val="808080"/>
+                <w:sz w:val="22"/>
+                <w:szCs w:val="22"/>
+              </w:rPr>
+            </w:pPr>
+            <w:r>
+              <w:rPr/>
+            </w:r>
+          </w:p>
+          <w:p>
+            <w:pPr>
+              <w:pStyle w:val="Normal"/>
+              <w:widowControl w:val="false"/>
+              <w:rPr/>
+            </w:pPr>
+            <w:r>
+              <w:rPr>
+                <w:color w:val="808080"/>
+                <w:sz w:val="22"/>
+                <w:szCs w:val="22"/>
+              </w:rPr>
+              <w:t>Este curso integral está diseñado para proporcionar a los estudiantes una sólida comprensión de los fundamentos del Machine Learning utilizando Python como herramienta principal. Además, se pone un fuerte énfasis en el desarrollo del pensamiento computacional, la promoción de la ciencia abierta a través de GitHub, Visual Studio Code y JupyterLab de Anaconda, así como el fomento de habilidades de comunicación científica en varios lenguajes clave.</w:t>
+            </w:r>
+          </w:p>
+          <w:p>
+            <w:pPr>
+              <w:pStyle w:val="Normal"/>
+              <w:widowControl w:val="false"/>
+              <w:rPr>
+                <w:color w:val="808080"/>
+                <w:sz w:val="22"/>
+                <w:szCs w:val="22"/>
+              </w:rPr>
+            </w:pPr>
+            <w:r>
+              <w:rPr/>
+            </w:r>
+          </w:p>
+          <w:p>
+            <w:pPr>
+              <w:pStyle w:val="Normal"/>
+              <w:widowControl w:val="false"/>
+              <w:rPr/>
+            </w:pPr>
+            <w:r>
+              <w:rPr>
+                <w:color w:val="808080"/>
+                <w:sz w:val="22"/>
+                <w:szCs w:val="22"/>
+              </w:rPr>
+              <w:t>**Contenido del Curso:**</w:t>
+            </w:r>
+          </w:p>
+          <w:p>
+            <w:pPr>
+              <w:pStyle w:val="Normal"/>
+              <w:widowControl w:val="false"/>
+              <w:rPr>
+                <w:color w:val="808080"/>
+                <w:sz w:val="22"/>
+                <w:szCs w:val="22"/>
+              </w:rPr>
+            </w:pPr>
+            <w:r>
+              <w:rPr/>
+            </w:r>
+          </w:p>
+          <w:p>
+            <w:pPr>
+              <w:pStyle w:val="Normal"/>
+              <w:widowControl w:val="false"/>
+              <w:rPr/>
+            </w:pPr>
+            <w:r>
+              <w:rPr>
+                <w:color w:val="808080"/>
+                <w:sz w:val="22"/>
+                <w:szCs w:val="22"/>
+              </w:rPr>
+              <w:t>1. **Módulo 1: Fundamentos de Python y Pensamiento Computacional**</w:t>
             </w:r>
           </w:p>
           <w:p>
@@ -1717,38 +1831,884 @@
               </w:rPr>
               <w:t xml:space="preserve">   </w:t>
             </w:r>
-          </w:p>
-          <w:p>
-            <w:pPr>
-              <w:pStyle w:val="Normal"/>
-              <w:widowControl w:val="false"/>
-              <w:rPr>
-                <w:color w:val="808080"/>
-                <w:sz w:val="22"/>
-                <w:szCs w:val="22"/>
-              </w:rPr>
-            </w:pPr>
-            <w:r>
-              <w:rPr>
-                <w:color w:val="808080"/>
-                <w:sz w:val="22"/>
-                <w:szCs w:val="22"/>
-              </w:rPr>
-            </w:r>
-          </w:p>
-          <w:p>
-            <w:pPr>
-              <w:pStyle w:val="Normal"/>
-              <w:widowControl w:val="false"/>
-              <w:rPr/>
-            </w:pPr>
-            <w:r>
-              <w:rPr>
-                <w:color w:val="808080"/>
-                <w:sz w:val="22"/>
-                <w:szCs w:val="22"/>
-              </w:rPr>
-              <w:t xml:space="preserve">  </w:t>
+            <w:r>
+              <w:rPr>
+                <w:color w:val="808080"/>
+                <w:sz w:val="22"/>
+                <w:szCs w:val="22"/>
+              </w:rPr>
+              <w:t>- Introducción a Python y entorno de desarrollo.</w:t>
+            </w:r>
+          </w:p>
+          <w:p>
+            <w:pPr>
+              <w:pStyle w:val="Normal"/>
+              <w:widowControl w:val="false"/>
+              <w:rPr/>
+            </w:pPr>
+            <w:r>
+              <w:rPr>
+                <w:color w:val="808080"/>
+                <w:sz w:val="22"/>
+                <w:szCs w:val="22"/>
+              </w:rPr>
+              <w:t xml:space="preserve">   </w:t>
+            </w:r>
+            <w:r>
+              <w:rPr>
+                <w:color w:val="808080"/>
+                <w:sz w:val="22"/>
+                <w:szCs w:val="22"/>
+              </w:rPr>
+              <w:t>- Desarrollo del pensamiento computacional.</w:t>
+            </w:r>
+          </w:p>
+          <w:p>
+            <w:pPr>
+              <w:pStyle w:val="Normal"/>
+              <w:widowControl w:val="false"/>
+              <w:rPr/>
+            </w:pPr>
+            <w:r>
+              <w:rPr>
+                <w:color w:val="808080"/>
+                <w:sz w:val="22"/>
+                <w:szCs w:val="22"/>
+              </w:rPr>
+              <w:t xml:space="preserve">   </w:t>
+            </w:r>
+            <w:r>
+              <w:rPr>
+                <w:color w:val="808080"/>
+                <w:sz w:val="22"/>
+                <w:szCs w:val="22"/>
+              </w:rPr>
+              <w:t>- Estructuras de control de flujo y funciones en Python.</w:t>
+            </w:r>
+          </w:p>
+          <w:p>
+            <w:pPr>
+              <w:pStyle w:val="Normal"/>
+              <w:widowControl w:val="false"/>
+              <w:rPr>
+                <w:color w:val="808080"/>
+                <w:sz w:val="22"/>
+                <w:szCs w:val="22"/>
+              </w:rPr>
+            </w:pPr>
+            <w:r>
+              <w:rPr/>
+            </w:r>
+          </w:p>
+          <w:p>
+            <w:pPr>
+              <w:pStyle w:val="Normal"/>
+              <w:widowControl w:val="false"/>
+              <w:rPr/>
+            </w:pPr>
+            <w:r>
+              <w:rPr>
+                <w:color w:val="808080"/>
+                <w:sz w:val="22"/>
+                <w:szCs w:val="22"/>
+              </w:rPr>
+              <w:t>2. **Módulo 2: Introducción al Machine Learning**</w:t>
+            </w:r>
+          </w:p>
+          <w:p>
+            <w:pPr>
+              <w:pStyle w:val="Normal"/>
+              <w:widowControl w:val="false"/>
+              <w:rPr/>
+            </w:pPr>
+            <w:r>
+              <w:rPr>
+                <w:color w:val="808080"/>
+                <w:sz w:val="22"/>
+                <w:szCs w:val="22"/>
+              </w:rPr>
+              <w:t xml:space="preserve">   </w:t>
+            </w:r>
+            <w:r>
+              <w:rPr>
+                <w:color w:val="808080"/>
+                <w:sz w:val="22"/>
+                <w:szCs w:val="22"/>
+              </w:rPr>
+              <w:t>- Conceptos básicos de Machine Learning.</w:t>
+            </w:r>
+          </w:p>
+          <w:p>
+            <w:pPr>
+              <w:pStyle w:val="Normal"/>
+              <w:widowControl w:val="false"/>
+              <w:rPr/>
+            </w:pPr>
+            <w:r>
+              <w:rPr>
+                <w:color w:val="808080"/>
+                <w:sz w:val="22"/>
+                <w:szCs w:val="22"/>
+              </w:rPr>
+              <w:t xml:space="preserve">   </w:t>
+            </w:r>
+            <w:r>
+              <w:rPr>
+                <w:color w:val="808080"/>
+                <w:sz w:val="22"/>
+                <w:szCs w:val="22"/>
+              </w:rPr>
+              <w:t>- Tipos de aprendizaje (supervisado, no supervisado, reforzado).</w:t>
+            </w:r>
+          </w:p>
+          <w:p>
+            <w:pPr>
+              <w:pStyle w:val="Normal"/>
+              <w:widowControl w:val="false"/>
+              <w:rPr/>
+            </w:pPr>
+            <w:r>
+              <w:rPr>
+                <w:color w:val="808080"/>
+                <w:sz w:val="22"/>
+                <w:szCs w:val="22"/>
+              </w:rPr>
+              <w:t xml:space="preserve">   </w:t>
+            </w:r>
+            <w:r>
+              <w:rPr>
+                <w:color w:val="808080"/>
+                <w:sz w:val="22"/>
+                <w:szCs w:val="22"/>
+              </w:rPr>
+              <w:t>- Preprocesamiento de datos y exploración.</w:t>
+            </w:r>
+          </w:p>
+          <w:p>
+            <w:pPr>
+              <w:pStyle w:val="Normal"/>
+              <w:widowControl w:val="false"/>
+              <w:rPr>
+                <w:color w:val="808080"/>
+                <w:sz w:val="22"/>
+                <w:szCs w:val="22"/>
+              </w:rPr>
+            </w:pPr>
+            <w:r>
+              <w:rPr/>
+            </w:r>
+          </w:p>
+          <w:p>
+            <w:pPr>
+              <w:pStyle w:val="Normal"/>
+              <w:widowControl w:val="false"/>
+              <w:rPr/>
+            </w:pPr>
+            <w:r>
+              <w:rPr>
+                <w:color w:val="808080"/>
+                <w:sz w:val="22"/>
+                <w:szCs w:val="22"/>
+              </w:rPr>
+              <w:t>3. **Módulo 3: Desarrollo de Modelos con Scikit-Learn**</w:t>
+            </w:r>
+          </w:p>
+          <w:p>
+            <w:pPr>
+              <w:pStyle w:val="Normal"/>
+              <w:widowControl w:val="false"/>
+              <w:rPr/>
+            </w:pPr>
+            <w:r>
+              <w:rPr>
+                <w:color w:val="808080"/>
+                <w:sz w:val="22"/>
+                <w:szCs w:val="22"/>
+              </w:rPr>
+              <w:t xml:space="preserve">   </w:t>
+            </w:r>
+            <w:r>
+              <w:rPr>
+                <w:color w:val="808080"/>
+                <w:sz w:val="22"/>
+                <w:szCs w:val="22"/>
+              </w:rPr>
+              <w:t>- Uso de Scikit-Learn para implementar algoritmos de Machine Learning.</w:t>
+            </w:r>
+          </w:p>
+          <w:p>
+            <w:pPr>
+              <w:pStyle w:val="Normal"/>
+              <w:widowControl w:val="false"/>
+              <w:rPr/>
+            </w:pPr>
+            <w:r>
+              <w:rPr>
+                <w:color w:val="808080"/>
+                <w:sz w:val="22"/>
+                <w:szCs w:val="22"/>
+              </w:rPr>
+              <w:t xml:space="preserve">   </w:t>
+            </w:r>
+            <w:r>
+              <w:rPr>
+                <w:color w:val="808080"/>
+                <w:sz w:val="22"/>
+                <w:szCs w:val="22"/>
+              </w:rPr>
+              <w:t>- Evaluación de modelos y ajuste de hiperparámetros.</w:t>
+            </w:r>
+          </w:p>
+          <w:p>
+            <w:pPr>
+              <w:pStyle w:val="Normal"/>
+              <w:widowControl w:val="false"/>
+              <w:rPr/>
+            </w:pPr>
+            <w:r>
+              <w:rPr>
+                <w:color w:val="808080"/>
+                <w:sz w:val="22"/>
+                <w:szCs w:val="22"/>
+              </w:rPr>
+              <w:t xml:space="preserve">   </w:t>
+            </w:r>
+            <w:r>
+              <w:rPr>
+                <w:color w:val="808080"/>
+                <w:sz w:val="22"/>
+                <w:szCs w:val="22"/>
+              </w:rPr>
+              <w:t>- Aplicaciones prácticas en casos de estudio.</w:t>
+            </w:r>
+          </w:p>
+          <w:p>
+            <w:pPr>
+              <w:pStyle w:val="Normal"/>
+              <w:widowControl w:val="false"/>
+              <w:rPr>
+                <w:color w:val="808080"/>
+                <w:sz w:val="22"/>
+                <w:szCs w:val="22"/>
+              </w:rPr>
+            </w:pPr>
+            <w:r>
+              <w:rPr/>
+            </w:r>
+          </w:p>
+          <w:p>
+            <w:pPr>
+              <w:pStyle w:val="Normal"/>
+              <w:widowControl w:val="false"/>
+              <w:rPr/>
+            </w:pPr>
+            <w:r>
+              <w:rPr>
+                <w:color w:val="808080"/>
+                <w:sz w:val="22"/>
+                <w:szCs w:val="22"/>
+              </w:rPr>
+              <w:t>4. **Módulo 4: Ciencia Abierta con GitHub y Versionamiento con Git**</w:t>
+            </w:r>
+          </w:p>
+          <w:p>
+            <w:pPr>
+              <w:pStyle w:val="Normal"/>
+              <w:widowControl w:val="false"/>
+              <w:rPr/>
+            </w:pPr>
+            <w:r>
+              <w:rPr>
+                <w:color w:val="808080"/>
+                <w:sz w:val="22"/>
+                <w:szCs w:val="22"/>
+              </w:rPr>
+              <w:t xml:space="preserve">   </w:t>
+            </w:r>
+            <w:r>
+              <w:rPr>
+                <w:color w:val="808080"/>
+                <w:sz w:val="22"/>
+                <w:szCs w:val="22"/>
+              </w:rPr>
+              <w:t>- Introducción a GitHub y colaboración en proyectos.</w:t>
+            </w:r>
+          </w:p>
+          <w:p>
+            <w:pPr>
+              <w:pStyle w:val="Normal"/>
+              <w:widowControl w:val="false"/>
+              <w:rPr/>
+            </w:pPr>
+            <w:r>
+              <w:rPr>
+                <w:color w:val="808080"/>
+                <w:sz w:val="22"/>
+                <w:szCs w:val="22"/>
+              </w:rPr>
+              <w:t xml:space="preserve">   </w:t>
+            </w:r>
+            <w:r>
+              <w:rPr>
+                <w:color w:val="808080"/>
+                <w:sz w:val="22"/>
+                <w:szCs w:val="22"/>
+              </w:rPr>
+              <w:t>- Versionamiento de código con Git.</w:t>
+            </w:r>
+          </w:p>
+          <w:p>
+            <w:pPr>
+              <w:pStyle w:val="Normal"/>
+              <w:widowControl w:val="false"/>
+              <w:rPr/>
+            </w:pPr>
+            <w:r>
+              <w:rPr>
+                <w:color w:val="808080"/>
+                <w:sz w:val="22"/>
+                <w:szCs w:val="22"/>
+              </w:rPr>
+              <w:t xml:space="preserve">   </w:t>
+            </w:r>
+            <w:r>
+              <w:rPr>
+                <w:color w:val="808080"/>
+                <w:sz w:val="22"/>
+                <w:szCs w:val="22"/>
+              </w:rPr>
+              <w:t>- Prácticas de ciencia abierta y colaboración en proyectos de código abierto.</w:t>
+            </w:r>
+          </w:p>
+          <w:p>
+            <w:pPr>
+              <w:pStyle w:val="Normal"/>
+              <w:widowControl w:val="false"/>
+              <w:rPr>
+                <w:color w:val="808080"/>
+                <w:sz w:val="22"/>
+                <w:szCs w:val="22"/>
+              </w:rPr>
+            </w:pPr>
+            <w:r>
+              <w:rPr/>
+            </w:r>
+          </w:p>
+          <w:p>
+            <w:pPr>
+              <w:pStyle w:val="Normal"/>
+              <w:widowControl w:val="false"/>
+              <w:rPr/>
+            </w:pPr>
+            <w:r>
+              <w:rPr>
+                <w:color w:val="808080"/>
+                <w:sz w:val="22"/>
+                <w:szCs w:val="22"/>
+              </w:rPr>
+              <w:t>5. **Módulo 5: Desarrollo con Visual Studio Code y JupyterLab de Anaconda**</w:t>
+            </w:r>
+          </w:p>
+          <w:p>
+            <w:pPr>
+              <w:pStyle w:val="Normal"/>
+              <w:widowControl w:val="false"/>
+              <w:rPr/>
+            </w:pPr>
+            <w:r>
+              <w:rPr>
+                <w:color w:val="808080"/>
+                <w:sz w:val="22"/>
+                <w:szCs w:val="22"/>
+              </w:rPr>
+              <w:t xml:space="preserve">   </w:t>
+            </w:r>
+            <w:r>
+              <w:rPr>
+                <w:color w:val="808080"/>
+                <w:sz w:val="22"/>
+                <w:szCs w:val="22"/>
+              </w:rPr>
+              <w:t>- Configuración y uso eficiente de Visual Studio Code.</w:t>
+            </w:r>
+          </w:p>
+          <w:p>
+            <w:pPr>
+              <w:pStyle w:val="Normal"/>
+              <w:widowControl w:val="false"/>
+              <w:rPr/>
+            </w:pPr>
+            <w:r>
+              <w:rPr>
+                <w:color w:val="808080"/>
+                <w:sz w:val="22"/>
+                <w:szCs w:val="22"/>
+              </w:rPr>
+              <w:t xml:space="preserve">   </w:t>
+            </w:r>
+            <w:r>
+              <w:rPr>
+                <w:color w:val="808080"/>
+                <w:sz w:val="22"/>
+                <w:szCs w:val="22"/>
+              </w:rPr>
+              <w:t>- Trabajo interactivo con JupyterLab de Anaconda.</w:t>
+            </w:r>
+          </w:p>
+          <w:p>
+            <w:pPr>
+              <w:pStyle w:val="Normal"/>
+              <w:widowControl w:val="false"/>
+              <w:rPr/>
+            </w:pPr>
+            <w:r>
+              <w:rPr>
+                <w:color w:val="808080"/>
+                <w:sz w:val="22"/>
+                <w:szCs w:val="22"/>
+              </w:rPr>
+              <w:t xml:space="preserve">   </w:t>
+            </w:r>
+            <w:r>
+              <w:rPr>
+                <w:color w:val="808080"/>
+                <w:sz w:val="22"/>
+                <w:szCs w:val="22"/>
+              </w:rPr>
+              <w:t>- Integración de herramientas para desarrollo eficiente.</w:t>
+            </w:r>
+          </w:p>
+          <w:p>
+            <w:pPr>
+              <w:pStyle w:val="Normal"/>
+              <w:widowControl w:val="false"/>
+              <w:rPr>
+                <w:color w:val="808080"/>
+                <w:sz w:val="22"/>
+                <w:szCs w:val="22"/>
+              </w:rPr>
+            </w:pPr>
+            <w:r>
+              <w:rPr/>
+            </w:r>
+          </w:p>
+          <w:p>
+            <w:pPr>
+              <w:pStyle w:val="Normal"/>
+              <w:widowControl w:val="false"/>
+              <w:rPr/>
+            </w:pPr>
+            <w:r>
+              <w:rPr>
+                <w:color w:val="808080"/>
+                <w:sz w:val="22"/>
+                <w:szCs w:val="22"/>
+              </w:rPr>
+              <w:t>6. **Módulo 6: Habilidades de Comunicación Científica en Python**</w:t>
+            </w:r>
+          </w:p>
+          <w:p>
+            <w:pPr>
+              <w:pStyle w:val="Normal"/>
+              <w:widowControl w:val="false"/>
+              <w:rPr/>
+            </w:pPr>
+            <w:r>
+              <w:rPr>
+                <w:color w:val="808080"/>
+                <w:sz w:val="22"/>
+                <w:szCs w:val="22"/>
+              </w:rPr>
+              <w:t xml:space="preserve">   </w:t>
+            </w:r>
+            <w:r>
+              <w:rPr>
+                <w:color w:val="808080"/>
+                <w:sz w:val="22"/>
+                <w:szCs w:val="22"/>
+              </w:rPr>
+              <w:t>- Uso de Markdown para la documentación científica.</w:t>
+            </w:r>
+          </w:p>
+          <w:p>
+            <w:pPr>
+              <w:pStyle w:val="Normal"/>
+              <w:widowControl w:val="false"/>
+              <w:rPr/>
+            </w:pPr>
+            <w:r>
+              <w:rPr>
+                <w:color w:val="808080"/>
+                <w:sz w:val="22"/>
+                <w:szCs w:val="22"/>
+              </w:rPr>
+              <w:t xml:space="preserve">   </w:t>
+            </w:r>
+            <w:r>
+              <w:rPr>
+                <w:color w:val="808080"/>
+                <w:sz w:val="22"/>
+                <w:szCs w:val="22"/>
+              </w:rPr>
+              <w:t>- Creación de informes y presentaciones con Jupyter Notebooks.</w:t>
+            </w:r>
+          </w:p>
+          <w:p>
+            <w:pPr>
+              <w:pStyle w:val="Normal"/>
+              <w:widowControl w:val="false"/>
+              <w:rPr/>
+            </w:pPr>
+            <w:r>
+              <w:rPr>
+                <w:color w:val="808080"/>
+                <w:sz w:val="22"/>
+                <w:szCs w:val="22"/>
+              </w:rPr>
+              <w:t xml:space="preserve">   </w:t>
+            </w:r>
+            <w:r>
+              <w:rPr>
+                <w:color w:val="808080"/>
+                <w:sz w:val="22"/>
+                <w:szCs w:val="22"/>
+              </w:rPr>
+              <w:t>- Prácticas de escritura científica y comunicación efectiva.</w:t>
+            </w:r>
+          </w:p>
+          <w:p>
+            <w:pPr>
+              <w:pStyle w:val="Normal"/>
+              <w:widowControl w:val="false"/>
+              <w:rPr>
+                <w:color w:val="808080"/>
+                <w:sz w:val="22"/>
+                <w:szCs w:val="22"/>
+              </w:rPr>
+            </w:pPr>
+            <w:r>
+              <w:rPr/>
+            </w:r>
+          </w:p>
+          <w:p>
+            <w:pPr>
+              <w:pStyle w:val="Normal"/>
+              <w:widowControl w:val="false"/>
+              <w:rPr/>
+            </w:pPr>
+            <w:r>
+              <w:rPr>
+                <w:color w:val="808080"/>
+                <w:sz w:val="22"/>
+                <w:szCs w:val="22"/>
+              </w:rPr>
+              <w:t>7. **Módulo 7: Multilingüismo en Ciencia de Datos y Machine Learning**</w:t>
+            </w:r>
+          </w:p>
+          <w:p>
+            <w:pPr>
+              <w:pStyle w:val="Normal"/>
+              <w:widowControl w:val="false"/>
+              <w:rPr/>
+            </w:pPr>
+            <w:r>
+              <w:rPr>
+                <w:color w:val="808080"/>
+                <w:sz w:val="22"/>
+                <w:szCs w:val="22"/>
+              </w:rPr>
+              <w:t xml:space="preserve">   </w:t>
+            </w:r>
+            <w:r>
+              <w:rPr>
+                <w:color w:val="808080"/>
+                <w:sz w:val="22"/>
+                <w:szCs w:val="22"/>
+              </w:rPr>
+              <w:t>- Uso de Python y bibliotecas multilingües.</w:t>
+            </w:r>
+          </w:p>
+          <w:p>
+            <w:pPr>
+              <w:pStyle w:val="Normal"/>
+              <w:widowControl w:val="false"/>
+              <w:rPr/>
+            </w:pPr>
+            <w:r>
+              <w:rPr>
+                <w:color w:val="808080"/>
+                <w:sz w:val="22"/>
+                <w:szCs w:val="22"/>
+              </w:rPr>
+              <w:t xml:space="preserve">   </w:t>
+            </w:r>
+            <w:r>
+              <w:rPr>
+                <w:color w:val="808080"/>
+                <w:sz w:val="22"/>
+                <w:szCs w:val="22"/>
+              </w:rPr>
+              <w:t>- Introducción a LaTeX para la preparación de documentos científicos.</w:t>
+            </w:r>
+          </w:p>
+          <w:p>
+            <w:pPr>
+              <w:pStyle w:val="Normal"/>
+              <w:widowControl w:val="false"/>
+              <w:rPr/>
+            </w:pPr>
+            <w:r>
+              <w:rPr>
+                <w:color w:val="808080"/>
+                <w:sz w:val="22"/>
+                <w:szCs w:val="22"/>
+              </w:rPr>
+              <w:t xml:space="preserve">   </w:t>
+            </w:r>
+            <w:r>
+              <w:rPr>
+                <w:color w:val="808080"/>
+                <w:sz w:val="22"/>
+                <w:szCs w:val="22"/>
+              </w:rPr>
+              <w:t>- Desarrollo de habilidades de comunicación en inglés para informes y presentaciones.</w:t>
+            </w:r>
+          </w:p>
+          <w:p>
+            <w:pPr>
+              <w:pStyle w:val="Normal"/>
+              <w:widowControl w:val="false"/>
+              <w:rPr>
+                <w:color w:val="808080"/>
+                <w:sz w:val="22"/>
+                <w:szCs w:val="22"/>
+              </w:rPr>
+            </w:pPr>
+            <w:r>
+              <w:rPr/>
+            </w:r>
+          </w:p>
+          <w:p>
+            <w:pPr>
+              <w:pStyle w:val="Normal"/>
+              <w:widowControl w:val="false"/>
+              <w:rPr/>
+            </w:pPr>
+            <w:r>
+              <w:rPr>
+                <w:color w:val="808080"/>
+                <w:sz w:val="22"/>
+                <w:szCs w:val="22"/>
+              </w:rPr>
+              <w:t>**Metodología de Enseñanza:**</w:t>
+            </w:r>
+          </w:p>
+          <w:p>
+            <w:pPr>
+              <w:pStyle w:val="Normal"/>
+              <w:widowControl w:val="false"/>
+              <w:rPr>
+                <w:color w:val="808080"/>
+                <w:sz w:val="22"/>
+                <w:szCs w:val="22"/>
+              </w:rPr>
+            </w:pPr>
+            <w:r>
+              <w:rPr/>
+            </w:r>
+          </w:p>
+          <w:p>
+            <w:pPr>
+              <w:pStyle w:val="Normal"/>
+              <w:widowControl w:val="false"/>
+              <w:rPr/>
+            </w:pPr>
+            <w:r>
+              <w:rPr>
+                <w:color w:val="808080"/>
+                <w:sz w:val="22"/>
+                <w:szCs w:val="22"/>
+              </w:rPr>
+              <w:t>- Clases teóricas interactivas.</w:t>
+            </w:r>
+          </w:p>
+          <w:p>
+            <w:pPr>
+              <w:pStyle w:val="Normal"/>
+              <w:widowControl w:val="false"/>
+              <w:rPr/>
+            </w:pPr>
+            <w:r>
+              <w:rPr>
+                <w:color w:val="808080"/>
+                <w:sz w:val="22"/>
+                <w:szCs w:val="22"/>
+              </w:rPr>
+              <w:t>- Prácticas guiadas y asignaciones.</w:t>
+            </w:r>
+          </w:p>
+          <w:p>
+            <w:pPr>
+              <w:pStyle w:val="Normal"/>
+              <w:widowControl w:val="false"/>
+              <w:rPr/>
+            </w:pPr>
+            <w:r>
+              <w:rPr>
+                <w:color w:val="808080"/>
+                <w:sz w:val="22"/>
+                <w:szCs w:val="22"/>
+              </w:rPr>
+              <w:t>- Proyectos prácticos utilizando GitHub para la colaboración.</w:t>
+            </w:r>
+          </w:p>
+          <w:p>
+            <w:pPr>
+              <w:pStyle w:val="Normal"/>
+              <w:widowControl w:val="false"/>
+              <w:rPr/>
+            </w:pPr>
+            <w:r>
+              <w:rPr>
+                <w:color w:val="808080"/>
+                <w:sz w:val="22"/>
+                <w:szCs w:val="22"/>
+              </w:rPr>
+              <w:t>- Evaluaciones regulares para medir el progreso.</w:t>
+            </w:r>
+          </w:p>
+          <w:p>
+            <w:pPr>
+              <w:pStyle w:val="Normal"/>
+              <w:widowControl w:val="false"/>
+              <w:rPr>
+                <w:color w:val="808080"/>
+                <w:sz w:val="22"/>
+                <w:szCs w:val="22"/>
+              </w:rPr>
+            </w:pPr>
+            <w:r>
+              <w:rPr/>
+            </w:r>
+          </w:p>
+          <w:p>
+            <w:pPr>
+              <w:pStyle w:val="Normal"/>
+              <w:widowControl w:val="false"/>
+              <w:rPr/>
+            </w:pPr>
+            <w:r>
+              <w:rPr>
+                <w:color w:val="808080"/>
+                <w:sz w:val="22"/>
+                <w:szCs w:val="22"/>
+              </w:rPr>
+              <w:t>**Requisitos Previos:**</w:t>
+            </w:r>
+          </w:p>
+          <w:p>
+            <w:pPr>
+              <w:pStyle w:val="Normal"/>
+              <w:widowControl w:val="false"/>
+              <w:rPr>
+                <w:color w:val="808080"/>
+                <w:sz w:val="22"/>
+                <w:szCs w:val="22"/>
+              </w:rPr>
+            </w:pPr>
+            <w:r>
+              <w:rPr/>
+            </w:r>
+          </w:p>
+          <w:p>
+            <w:pPr>
+              <w:pStyle w:val="Normal"/>
+              <w:widowControl w:val="false"/>
+              <w:rPr/>
+            </w:pPr>
+            <w:r>
+              <w:rPr>
+                <w:color w:val="808080"/>
+                <w:sz w:val="22"/>
+                <w:szCs w:val="22"/>
+              </w:rPr>
+              <w:t>- Conocimientos básicos de programación.</w:t>
+            </w:r>
+          </w:p>
+          <w:p>
+            <w:pPr>
+              <w:pStyle w:val="Normal"/>
+              <w:widowControl w:val="false"/>
+              <w:rPr/>
+            </w:pPr>
+            <w:r>
+              <w:rPr>
+                <w:color w:val="808080"/>
+                <w:sz w:val="22"/>
+                <w:szCs w:val="22"/>
+              </w:rPr>
+              <w:t>- Disposición para aprender y participar activamente en proyectos prácticos.</w:t>
+            </w:r>
+          </w:p>
+          <w:p>
+            <w:pPr>
+              <w:pStyle w:val="Normal"/>
+              <w:widowControl w:val="false"/>
+              <w:rPr>
+                <w:color w:val="808080"/>
+                <w:sz w:val="22"/>
+                <w:szCs w:val="22"/>
+              </w:rPr>
+            </w:pPr>
+            <w:r>
+              <w:rPr/>
+            </w:r>
+          </w:p>
+          <w:p>
+            <w:pPr>
+              <w:pStyle w:val="Normal"/>
+              <w:widowControl w:val="false"/>
+              <w:rPr/>
+            </w:pPr>
+            <w:r>
+              <w:rPr>
+                <w:color w:val="808080"/>
+                <w:sz w:val="22"/>
+                <w:szCs w:val="22"/>
+              </w:rPr>
+              <w:t>Al completar este curso, los estudiantes no solo obtendrán habilidades técnicas sólidas en Machine Learning con Python, sino que también desarrollarán habilidades esenciales en pensamiento computacional, ciencia abierta, y comunicación científica, lo que los preparará para enfrentar desafíos del mundo real en el campo de la ciencia de datos.</w:t>
+            </w:r>
+          </w:p>
+          <w:p>
+            <w:pPr>
+              <w:pStyle w:val="Normal"/>
+              <w:widowControl w:val="false"/>
+              <w:rPr>
+                <w:color w:val="808080"/>
+                <w:sz w:val="22"/>
+                <w:szCs w:val="22"/>
+              </w:rPr>
+            </w:pPr>
+            <w:r>
+              <w:rPr>
+                <w:color w:val="808080"/>
+                <w:sz w:val="22"/>
+                <w:szCs w:val="22"/>
+              </w:rPr>
+            </w:r>
+          </w:p>
+          <w:p>
+            <w:pPr>
+              <w:pStyle w:val="Normal"/>
+              <w:widowControl w:val="false"/>
+              <w:rPr>
+                <w:color w:val="808080"/>
+                <w:sz w:val="22"/>
+                <w:szCs w:val="22"/>
+              </w:rPr>
+            </w:pPr>
+            <w:r>
+              <w:rPr/>
             </w:r>
           </w:p>
           <w:p>
@@ -4136,8 +5096,8 @@
         <w:tblLook w:val="0600" w:noHBand="1" w:noVBand="1" w:firstColumn="0" w:lastRow="0" w:lastColumn="0" w:firstRow="0"/>
       </w:tblPr>
       <w:tblGrid>
-        <w:gridCol w:w="6097"/>
-        <w:gridCol w:w="1419"/>
+        <w:gridCol w:w="6096"/>
+        <w:gridCol w:w="1420"/>
         <w:gridCol w:w="2979"/>
       </w:tblGrid>
       <w:tr>
@@ -4905,7 +5865,7 @@
         </w:trPr>
         <w:tc>
           <w:tcPr>
-            <w:tcW w:w="6097" w:type="dxa"/>
+            <w:tcW w:w="6096" w:type="dxa"/>
             <w:tcBorders>
               <w:top w:val="single" w:sz="4" w:space="0" w:color="7F7F7F"/>
               <w:left w:val="single" w:sz="4" w:space="0" w:color="7F7F7F"/>
@@ -4938,7 +5898,7 @@
         </w:tc>
         <w:tc>
           <w:tcPr>
-            <w:tcW w:w="1419" w:type="dxa"/>
+            <w:tcW w:w="1420" w:type="dxa"/>
             <w:tcBorders>
               <w:top w:val="single" w:sz="4" w:space="0" w:color="7F7F7F"/>
               <w:left w:val="single" w:sz="4" w:space="0" w:color="7F7F7F"/>
@@ -5009,7 +5969,7 @@
         </w:trPr>
         <w:tc>
           <w:tcPr>
-            <w:tcW w:w="6097" w:type="dxa"/>
+            <w:tcW w:w="6096" w:type="dxa"/>
             <w:tcBorders>
               <w:top w:val="single" w:sz="4" w:space="0" w:color="7F7F7F"/>
               <w:left w:val="single" w:sz="4" w:space="0" w:color="7F7F7F"/>
@@ -5037,7 +5997,7 @@
         </w:tc>
         <w:tc>
           <w:tcPr>
-            <w:tcW w:w="1419" w:type="dxa"/>
+            <w:tcW w:w="1420" w:type="dxa"/>
             <w:tcBorders>
               <w:top w:val="single" w:sz="4" w:space="0" w:color="7F7F7F"/>
               <w:left w:val="single" w:sz="4" w:space="0" w:color="7F7F7F"/>
@@ -5099,7 +6059,7 @@
         </w:trPr>
         <w:tc>
           <w:tcPr>
-            <w:tcW w:w="6097" w:type="dxa"/>
+            <w:tcW w:w="6096" w:type="dxa"/>
             <w:tcBorders>
               <w:top w:val="single" w:sz="4" w:space="0" w:color="7F7F7F"/>
               <w:left w:val="single" w:sz="4" w:space="0" w:color="7F7F7F"/>
@@ -5127,7 +6087,7 @@
         </w:tc>
         <w:tc>
           <w:tcPr>
-            <w:tcW w:w="1419" w:type="dxa"/>
+            <w:tcW w:w="1420" w:type="dxa"/>
             <w:tcBorders>
               <w:top w:val="single" w:sz="4" w:space="0" w:color="7F7F7F"/>
               <w:left w:val="single" w:sz="4" w:space="0" w:color="7F7F7F"/>
@@ -5189,7 +6149,7 @@
         </w:trPr>
         <w:tc>
           <w:tcPr>
-            <w:tcW w:w="6097" w:type="dxa"/>
+            <w:tcW w:w="6096" w:type="dxa"/>
             <w:tcBorders>
               <w:top w:val="single" w:sz="4" w:space="0" w:color="7F7F7F"/>
               <w:left w:val="single" w:sz="4" w:space="0" w:color="7F7F7F"/>
@@ -5217,7 +6177,7 @@
         </w:tc>
         <w:tc>
           <w:tcPr>
-            <w:tcW w:w="1419" w:type="dxa"/>
+            <w:tcW w:w="1420" w:type="dxa"/>
             <w:tcBorders>
               <w:top w:val="single" w:sz="4" w:space="0" w:color="7F7F7F"/>
               <w:left w:val="single" w:sz="4" w:space="0" w:color="7F7F7F"/>
@@ -5279,7 +6239,7 @@
         </w:trPr>
         <w:tc>
           <w:tcPr>
-            <w:tcW w:w="6097" w:type="dxa"/>
+            <w:tcW w:w="6096" w:type="dxa"/>
             <w:tcBorders>
               <w:top w:val="single" w:sz="4" w:space="0" w:color="7F7F7F"/>
               <w:left w:val="single" w:sz="4" w:space="0" w:color="7F7F7F"/>
@@ -5307,7 +6267,7 @@
         </w:tc>
         <w:tc>
           <w:tcPr>
-            <w:tcW w:w="1419" w:type="dxa"/>
+            <w:tcW w:w="1420" w:type="dxa"/>
             <w:tcBorders>
               <w:top w:val="single" w:sz="4" w:space="0" w:color="7F7F7F"/>
               <w:left w:val="single" w:sz="4" w:space="0" w:color="7F7F7F"/>
@@ -5369,7 +6329,7 @@
         </w:trPr>
         <w:tc>
           <w:tcPr>
-            <w:tcW w:w="6097" w:type="dxa"/>
+            <w:tcW w:w="6096" w:type="dxa"/>
             <w:tcBorders>
               <w:left w:val="single" w:sz="4" w:space="0" w:color="7F7F7F"/>
               <w:bottom w:val="single" w:sz="4" w:space="0" w:color="7F7F7F"/>
@@ -5392,7 +6352,7 @@
         </w:tc>
         <w:tc>
           <w:tcPr>
-            <w:tcW w:w="1419" w:type="dxa"/>
+            <w:tcW w:w="1420" w:type="dxa"/>
             <w:tcBorders>
               <w:left w:val="single" w:sz="4" w:space="0" w:color="7F7F7F"/>
               <w:bottom w:val="single" w:sz="4" w:space="0" w:color="7F7F7F"/>
@@ -5451,7 +6411,7 @@
         </w:trPr>
         <w:tc>
           <w:tcPr>
-            <w:tcW w:w="6097" w:type="dxa"/>
+            <w:tcW w:w="6096" w:type="dxa"/>
             <w:tcBorders>
               <w:left w:val="single" w:sz="4" w:space="0" w:color="7F7F7F"/>
               <w:bottom w:val="single" w:sz="4" w:space="0" w:color="7F7F7F"/>
@@ -5474,7 +6434,7 @@
         </w:tc>
         <w:tc>
           <w:tcPr>
-            <w:tcW w:w="1419" w:type="dxa"/>
+            <w:tcW w:w="1420" w:type="dxa"/>
             <w:tcBorders>
               <w:left w:val="single" w:sz="4" w:space="0" w:color="7F7F7F"/>
               <w:bottom w:val="single" w:sz="4" w:space="0" w:color="7F7F7F"/>
@@ -5532,7 +6492,7 @@
         </w:trPr>
         <w:tc>
           <w:tcPr>
-            <w:tcW w:w="6097" w:type="dxa"/>
+            <w:tcW w:w="6096" w:type="dxa"/>
             <w:tcBorders>
               <w:left w:val="single" w:sz="4" w:space="0" w:color="7F7F7F"/>
               <w:bottom w:val="single" w:sz="4" w:space="0" w:color="7F7F7F"/>
@@ -5555,7 +6515,7 @@
         </w:tc>
         <w:tc>
           <w:tcPr>
-            <w:tcW w:w="1419" w:type="dxa"/>
+            <w:tcW w:w="1420" w:type="dxa"/>
             <w:tcBorders>
               <w:left w:val="single" w:sz="4" w:space="0" w:color="7F7F7F"/>
               <w:bottom w:val="single" w:sz="4" w:space="0" w:color="7F7F7F"/>
@@ -5613,7 +6573,7 @@
         </w:trPr>
         <w:tc>
           <w:tcPr>
-            <w:tcW w:w="6097" w:type="dxa"/>
+            <w:tcW w:w="6096" w:type="dxa"/>
             <w:tcBorders>
               <w:left w:val="single" w:sz="4" w:space="0" w:color="7F7F7F"/>
               <w:bottom w:val="single" w:sz="4" w:space="0" w:color="7F7F7F"/>
@@ -5636,7 +6596,7 @@
         </w:tc>
         <w:tc>
           <w:tcPr>
-            <w:tcW w:w="1419" w:type="dxa"/>
+            <w:tcW w:w="1420" w:type="dxa"/>
             <w:tcBorders>
               <w:left w:val="single" w:sz="4" w:space="0" w:color="7F7F7F"/>
               <w:bottom w:val="single" w:sz="4" w:space="0" w:color="7F7F7F"/>
@@ -7640,7 +8600,7 @@
         <w:rFonts w:eastAsia="Calibri" w:cs="Calibri" w:ascii="Calibri" w:hAnsi="Calibri"/>
         <w:color w:val="000000"/>
       </w:rPr>
-      <w:t>7</w:t>
+      <w:t>8</w:t>
     </w:r>
     <w:r>
       <w:rPr>
@@ -7694,7 +8654,7 @@
         <w:rFonts w:eastAsia="Calibri" w:cs="Calibri" w:ascii="Calibri" w:hAnsi="Calibri"/>
         <w:color w:val="000000"/>
       </w:rPr>
-      <w:t>7</w:t>
+      <w:t>8</w:t>
     </w:r>
     <w:r>
       <w:rPr>

</xml_diff>